<commit_message>
Make final submission claims withstand model and checklist review
Apply the verified Superwing-routed Opus 5 review, document its provider boundary, and keep small-room 45-degree views far enough away for the full room to remain readable.

Constraint: Opus 5 response came through a third-party compatible provider, not verified Anthropic direct
Rejected: Change 2026 dates | contradicted system time and project records
Confidence: high
Scope-risk: narrow
Directive: Keep Aily and Base claims scoped to the verified turns; do not relabel them as production SLA
Tested: 273 tests, production build, native Pages PDF render, document privacy scrub, local 3D scene checks
Not-tested: ICP filing completion, Feishu public-link permission, final competition form submission
</commit_message>
<xml_diff>
--- a/submission/元界视创-欧派AI家装共识工作台-参赛方案.docx
+++ b/submission/元界视创-欧派AI家装共识工作台-参赛方案.docx
@@ -1560,7 +1560,7 @@
         <w:rPr>
           <w:rFonts w:ascii="Arial Unicode MS" w:hAnsi="Arial Unicode MS" w:eastAsia="Arial Unicode MS" w:cs="Arial Unicode MS"/>
         </w:rPr>
-        <w:t>系统只维护一套 canonical scene：户型、房间、墙地顶、门窗、家具 ID、变换、材质、能力、规则、版本与相机预设都来自同一数据源。2D 是同步的俯视总览，真实 3D 是主要浏览与编辑界面，避免“图上改了、模型没改”或多套数据互相漂移。</w:t>
+        <w:t>系统只维护一套标准场景数据（canonical scene）：户型、房间、墙地顶、门窗、家具 ID、位置与朝向、材质、能力、规则、版本和相机预设都来自同一数据源。2D 是同步的俯视总览，真实 3D 是主要浏览与编辑界面，避免“图上改了、模型没改”或多套数据互相漂移。</w:t>
       </w:r>
     </w:p>
     <w:p>
@@ -1630,7 +1630,7 @@
         <w:rPr>
           <w:rFonts w:ascii="Arial Unicode MS" w:hAnsi="Arial Unicode MS" w:eastAsia="Arial Unicode MS" w:cs="Arial Unicode MS"/>
         </w:rPr>
-        <w:t xml:space="preserve">系统已经打通飞书 Aily 的真实 Agent 回合与飞书多维表格写入/回读，但当前产品目录仍使用明确标记为 </w:t>
+        <w:t xml:space="preserve">系统已完成飞书 Aily 真实 Agent 回合和飞书多维表格写入/回读的端到端链路验证；该证据证明接口在验证回合中可用，不代表生产级稳定性。当前产品目录仍使用明确标记为 </w:t>
       </w:r>
       <w:r>
         <w:rPr>
@@ -2037,7 +2037,7 @@
         <w:rPr>
           <w:rFonts w:ascii="Arial Unicode MS" w:hAnsi="Arial Unicode MS" w:eastAsia="Arial Unicode MS" w:cs="Arial Unicode MS"/>
         </w:rPr>
-        <w:t>早期批量评估共 336 次调用，合并结果为 155 次通过、152 次契约失败、29 次服务失败。我们保留这些失败数据，因为它说明企业级 Agent 不能只靠“偶尔成功”，必须有契约校验、错误分层、降级与确定性规则兜底。</w:t>
+        <w:t>2026-08-14 的候选压力测试共执行 336 次调用，合并结果为 155 次通过、152 次契约失败、29 次服务失败；该结果用于暴露合同合规和服务波动问题，不代表当前产品成功率或生产 SLA。我们保留这些失败数据，因为它说明企业级 Agent 不能只靠“偶尔成功”，必须有契约校验、错误分层、降级与确定性规则兜底。</w:t>
       </w:r>
     </w:p>
     <w:p>
@@ -2710,7 +2710,7 @@
         <w:rPr>
           <w:rFonts w:ascii="Arial Unicode MS" w:hAnsi="Arial Unicode MS" w:eastAsia="Arial Unicode MS" w:cs="Arial Unicode MS"/>
         </w:rPr>
-        <w:t>阿里云部署、飞书 Aily 真实回合、飞书多维表格写入回读。</w:t>
+        <w:t>阿里云公网部署，以及飞书 Aily 单次真实回合和多维表格写入后回读的链路验证。</w:t>
       </w:r>
     </w:p>
     <w:p>

</xml_diff>

<commit_message>
Make the final submission directly shareable
Add the provided Douyin demo link to every submission format, publish the final Feishu document as internet-readable, and keep regenerated document metadata free of personal author fields.

Constraint: Preserve the reviewed 11-page PDF layout while adding clickable video links
Rejected: Use the Feishu-exported PDF | it reduced the reviewed layout and changed pagination
Confidence: high
Scope-risk: narrow
Directive: Keep the Feishu document URL and Douyin short link synchronized across README, checklist, Markdown, DOCX, and PDF
Tested: DOCX rebuild and ZIP integrity, blank author metadata, PDF 11 pages with two Douyin URI annotations, Feishu content fetch and public-permission fresh read
Not-tested: Final competition form submission
</commit_message>
<xml_diff>
--- a/submission/元界视创-欧派AI家装共识工作台-参赛方案.docx
+++ b/submission/元界视创-欧派AI家装共识工作台-参赛方案.docx
@@ -1032,19 +1032,15 @@
                 <w:rFonts w:ascii="Arial Unicode MS" w:hAnsi="Arial Unicode MS" w:eastAsia="Arial Unicode MS" w:cs="Arial Unicode MS"/>
               </w:rPr>
             </w:r>
-            <w:r>
-              <w:rPr>
-                <w:rFonts w:ascii="Arial Unicode MS" w:hAnsi="Arial Unicode MS" w:eastAsia="Arial Unicode MS" w:cs="Arial Unicode MS"/>
-                <w:b/>
-              </w:rPr>
-              <w:t>待补：成片链接</w:t>
-            </w:r>
-            <w:r>
-              <w:rPr>
-                <w:rFonts w:ascii="Arial Unicode MS" w:hAnsi="Arial Unicode MS" w:eastAsia="Arial Unicode MS" w:cs="Arial Unicode MS"/>
-              </w:rPr>
-              <w:t>（建议 3–5 分钟）</w:t>
-            </w:r>
+            <w:hyperlink r:id="rId13">
+              <w:r>
+                <w:rPr>
+                  <w:color w:val="8F3D57"/>
+                  <w:u w:val="single"/>
+                </w:rPr>
+                <w:t>抖音｜欧派共创空间 Demo 演示</w:t>
+              </w:r>
+            </w:hyperlink>
           </w:p>
         </w:tc>
       </w:tr>
@@ -1179,7 +1175,7 @@
                     <pic:cNvPicPr/>
                   </pic:nvPicPr>
                   <pic:blipFill>
-                    <a:blip r:embed="rId13"/>
+                    <a:blip r:embed="rId14"/>
                     <a:stretch>
                       <a:fillRect/>
                     </a:stretch>
@@ -1258,7 +1254,7 @@
                           <pic:cNvPicPr/>
                         </pic:nvPicPr>
                         <pic:blipFill>
-                          <a:blip r:embed="rId14"/>
+                          <a:blip r:embed="rId15"/>
                           <a:stretch>
                             <a:fillRect/>
                           </a:stretch>
@@ -1311,7 +1307,7 @@
                           <pic:cNvPicPr/>
                         </pic:nvPicPr>
                         <pic:blipFill>
-                          <a:blip r:embed="rId15"/>
+                          <a:blip r:embed="rId16"/>
                           <a:stretch>
                             <a:fillRect/>
                           </a:stretch>
@@ -1865,7 +1861,7 @@
                     <pic:cNvPicPr/>
                   </pic:nvPicPr>
                   <pic:blipFill>
-                    <a:blip r:embed="rId16"/>
+                    <a:blip r:embed="rId17"/>
                     <a:stretch>
                       <a:fillRect/>
                     </a:stretch>
@@ -2216,7 +2212,7 @@
                     <pic:cNvPicPr/>
                   </pic:nvPicPr>
                   <pic:blipFill>
-                    <a:blip r:embed="rId17"/>
+                    <a:blip r:embed="rId18"/>
                     <a:stretch>
                       <a:fillRect/>
                     </a:stretch>
@@ -2416,7 +2412,7 @@
         </w:rPr>
         <w:t>：</w:t>
       </w:r>
-      <w:hyperlink r:id="rId18">
+      <w:hyperlink r:id="rId19">
         <w:r>
           <w:rPr>
             <w:color w:val="8F3D57"/>
@@ -2450,13 +2446,15 @@
         </w:rPr>
         <w:t>：</w:t>
       </w:r>
-      <w:r>
-        <w:rPr>
-          <w:rFonts w:ascii="Arial Unicode MS" w:hAnsi="Arial Unicode MS" w:eastAsia="Arial Unicode MS" w:cs="Arial Unicode MS"/>
-          <w:b/>
-        </w:rPr>
-        <w:t>待补成片链接</w:t>
-      </w:r>
+      <w:hyperlink r:id="rId13">
+        <w:r>
+          <w:rPr>
+            <w:color w:val="8F3D57"/>
+            <w:u w:val="single"/>
+          </w:rPr>
+          <w:t>抖音｜欧派共创空间 Demo 演示</w:t>
+        </w:r>
+      </w:hyperlink>
     </w:p>
     <w:p>
       <w:r>
@@ -2786,7 +2784,7 @@
         <w:pStyle w:val="ListNumber"/>
         <w:ind w:left="312" w:hanging="142"/>
       </w:pPr>
-      <w:hyperlink r:id="rId19">
+      <w:hyperlink r:id="rId20">
         <w:r>
           <w:rPr>
             <w:color w:val="8F3D57"/>
@@ -2807,7 +2805,7 @@
         <w:pStyle w:val="ListNumber"/>
         <w:ind w:left="312" w:hanging="142"/>
       </w:pPr>
-      <w:hyperlink r:id="rId20">
+      <w:hyperlink r:id="rId21">
         <w:r>
           <w:rPr>
             <w:color w:val="8F3D57"/>
@@ -2828,7 +2826,7 @@
         <w:pStyle w:val="ListNumber"/>
         <w:ind w:left="312" w:hanging="142"/>
       </w:pPr>
-      <w:hyperlink r:id="rId21">
+      <w:hyperlink r:id="rId22">
         <w:r>
           <w:rPr>
             <w:color w:val="8F3D57"/>
@@ -2849,7 +2847,7 @@
         <w:pStyle w:val="ListNumber"/>
         <w:ind w:left="312" w:hanging="142"/>
       </w:pPr>
-      <w:hyperlink r:id="rId22">
+      <w:hyperlink r:id="rId23">
         <w:r>
           <w:rPr>
             <w:color w:val="8F3D57"/>
@@ -2870,7 +2868,7 @@
         <w:pStyle w:val="ListNumber"/>
         <w:ind w:left="312" w:hanging="142"/>
       </w:pPr>
-      <w:hyperlink r:id="rId23">
+      <w:hyperlink r:id="rId24">
         <w:r>
           <w:rPr>
             <w:color w:val="8F3D57"/>
@@ -2891,7 +2889,7 @@
         <w:pStyle w:val="ListNumber"/>
         <w:ind w:left="312" w:hanging="142"/>
       </w:pPr>
-      <w:hyperlink r:id="rId24">
+      <w:hyperlink r:id="rId25">
         <w:r>
           <w:rPr>
             <w:color w:val="8F3D57"/>

</xml_diff>